<commit_message>
feat: implement case management API and expand UI with case detail and custom document features
</commit_message>
<xml_diff>
--- a/templates/custom/case/bien_ban_lam_viec.docx
+++ b/templates/custom/case/bien_ban_lam_viec.docx
@@ -48,12 +48,12 @@
     <w:p/>
     <w:p>
       <w:r>
-        <w:t>Người tham gia / chứng kiến: { custom_field_1 }</w:t>
+        <w:t>Người tham gia / chứng kiến: {{ custom_field_1 }}</w:t>
       </w:r>
     </w:p>
     <w:p>
       <w:r>
-        <w:t>Nội dung làm việc: { custom_field_2 }</w:t>
+        <w:t>Nội dung làm việc: {{ custom_field_2 }}</w:t>
       </w:r>
     </w:p>
     <w:p>

</xml_diff>